<commit_message>
Release 0.1.0-alpha.2: cut windows and ruled table rows
Stages 1 and 2 landed in one working tree: session-block cut windows for fused columns, and horizontal-rule row grouping for tables whose every cell wraps. 112 tests pass; table-wrapped is the only golden changed (4 rows -> 3) and its diff was read before blessing.
</commit_message>
<xml_diff>
--- a/tests/fixtures/synthetic/table-wrapped.golden.docx
+++ b/tests/fixtures/synthetic/table-wrapped.golden.docx
@@ -45,6 +45,16 @@
               </w:rPr>
               <w:t xml:space="preserve">Connecté en</w:t>
             </w:r>
+            <w:r>
+              <w:t xml:space="preserve"> </w:t>
+            </w:r>
+            <w:r>
+              <w:rPr>
+                <w:rFonts w:ascii="Helvetica" w:hAnsi="Helvetica" w:cs="Helvetica"/>
+                <w:sz w:val="22"/>
+              </w:rPr>
+              <w:t xml:space="preserve">session</w:t>
+            </w:r>
           </w:p>
         </w:tc>
         <w:tc>
@@ -60,31 +70,9 @@
               </w:rPr>
               <w:t xml:space="preserve">Utilisateur ayant ouvert</w:t>
             </w:r>
-          </w:p>
-        </w:tc>
-      </w:tr>
-      <w:tr>
-        <w:tc>
-          <w:tcPr>
-            <w:tcW w:w="241" w:type="dxa"/>
-            <w:vAlign w:val="top"/>
-          </w:tcPr>
-          <w:p>
-            <w:r>
-              <w:rPr>
-                <w:rFonts w:ascii="Helvetica" w:hAnsi="Helvetica" w:cs="Helvetica"/>
-                <w:sz w:val="22"/>
-              </w:rPr>
-              <w:t xml:space="preserve">session</w:t>
-            </w:r>
-          </w:p>
-        </w:tc>
-        <w:tc>
-          <w:tcPr>
-            <w:tcW w:w="241" w:type="dxa"/>
-            <w:vAlign w:val="top"/>
-          </w:tcPr>
-          <w:p>
+            <w:r>
+              <w:t xml:space="preserve"> </w:t>
+            </w:r>
             <w:r>
               <w:rPr>
                 <w:rFonts w:ascii="Helvetica" w:hAnsi="Helvetica" w:cs="Helvetica"/>

</xml_diff>